<commit_message>
Brand parliamentary plan and annex with logo and colors
Co-Authored-By: Claude Opus 5.5 <noreply@anthropic.com>
Claude-Session: https://claude.ai/code/session_01AvePAVX1iu6f8WktU4YpYs
</commit_message>
<xml_diff>
--- a/research/נספח-אופרטיבי-נוסח-חוזר-אישור-לימוד-בחינוך-ביתי.docx
+++ b/research/נספח-אופרטיבי-נוסח-חוזר-אישור-לימוד-בחינוך-ביתי.docx
@@ -4,12 +4,52 @@
   <w:body>
     <w:p>
       <w:pPr>
+        <w:jc w:val="left"/>
+      </w:pPr>
+      <w:r>
+        <w:drawing>
+          <wp:inline xmlns:a="http://schemas.openxmlformats.org/drawingml/2006/main" xmlns:pic="http://schemas.openxmlformats.org/drawingml/2006/picture">
+            <wp:extent cx="1152000" cy="1052308"/>
+            <wp:docPr id="1" name="Picture 1"/>
+            <wp:cNvGraphicFramePr>
+              <a:graphicFrameLocks noChangeAspect="1"/>
+            </wp:cNvGraphicFramePr>
+            <a:graphic>
+              <a:graphicData uri="http://schemas.openxmlformats.org/drawingml/2006/picture">
+                <pic:pic>
+                  <pic:nvPicPr>
+                    <pic:cNvPr id="0" name="logo.png"/>
+                    <pic:cNvPicPr/>
+                  </pic:nvPicPr>
+                  <pic:blipFill>
+                    <a:blip r:embed="rId11"/>
+                    <a:stretch>
+                      <a:fillRect/>
+                    </a:stretch>
+                  </pic:blipFill>
+                  <pic:spPr>
+                    <a:xfrm>
+                      <a:off x="0" y="0"/>
+                      <a:ext cx="1152000" cy="1052308"/>
+                    </a:xfrm>
+                    <a:prstGeom prst="rect"/>
+                  </pic:spPr>
+                </pic:pic>
+              </a:graphicData>
+            </a:graphic>
+          </wp:inline>
+        </w:drawing>
+      </w:r>
+    </w:p>
+    <w:p>
+      <w:pPr>
         <w:bidi/>
         <w:jc w:val="right"/>
       </w:pPr>
       <w:r>
         <w:rPr>
           <w:b/>
+          <w:color w:val="1C3672"/>
           <w:sz w:val="40"/>
           <w:rtl/>
           <w:szCs w:val="40"/>
@@ -22,10 +62,14 @@
       <w:pPr>
         <w:bidi/>
         <w:jc w:val="right"/>
+        <w:pBdr>
+          <w:bottom w:val="single" w:sz="18" w:space="6" w:color="F0C000"/>
+        </w:pBdr>
       </w:pPr>
       <w:r>
         <w:rPr>
           <w:b/>
+          <w:color w:val="1C3672"/>
           <w:sz w:val="32"/>
           <w:rtl/>
           <w:szCs w:val="32"/>
@@ -57,6 +101,7 @@
       <w:r>
         <w:rPr>
           <w:b/>
+          <w:color w:val="1C3672"/>
           <w:sz w:val="28"/>
           <w:rtl/>
           <w:szCs w:val="28"/>
@@ -312,6 +357,7 @@
       <w:r>
         <w:rPr>
           <w:b/>
+          <w:color w:val="1C3672"/>
           <w:sz w:val="28"/>
           <w:rtl/>
           <w:szCs w:val="28"/>

</xml_diff>